<commit_message>
Codigo: Crear Cubo en 0,0,0  de medidas 1,2,3 cm (exitoso)
</commit_message>
<xml_diff>
--- a/InstruccionesChatGpt_Word/InstruccionesChatGpt_Word_011_Reglas.docx
+++ b/InstruccionesChatGpt_Word/InstruccionesChatGpt_Word_011_Reglas.docx
@@ -819,7 +819,7 @@
         </w:rPr>
       </w:pPr>
     </w:p>
-    <w:bookmarkStart w:id="0" w:name="_Toc228505768" w:displacedByCustomXml="next"/>
+    <w:bookmarkStart w:id="0" w:name="_Toc228567341" w:displacedByCustomXml="next"/>
     <w:sdt>
       <w:sdtPr>
         <w:rPr>
@@ -876,7 +876,7 @@
           <w:r>
             <w:fldChar w:fldCharType="separate"/>
           </w:r>
-          <w:hyperlink w:anchor="_Toc228505768" w:history="1">
+          <w:hyperlink w:anchor="_Toc228567341" w:history="1">
             <w:r>
               <w:rPr>
                 <w:rStyle w:val="Hipervnculo"/>
@@ -919,7 +919,7 @@
                 <w:noProof/>
                 <w:webHidden/>
               </w:rPr>
-              <w:instrText xml:space="preserve"> PAGEREF _Toc228505768 \h </w:instrText>
+              <w:instrText xml:space="preserve"> PAGEREF _Toc228567341 \h </w:instrText>
             </w:r>
             <w:r>
               <w:rPr>
@@ -964,7 +964,7 @@
               <w:lang w:eastAsia="es-CO"/>
             </w:rPr>
           </w:pPr>
-          <w:hyperlink w:anchor="_Toc228505769" w:history="1">
+          <w:hyperlink w:anchor="_Toc228567342" w:history="1">
             <w:r>
               <w:rPr>
                 <w:rStyle w:val="Hipervnculo"/>
@@ -1007,7 +1007,7 @@
                 <w:noProof/>
                 <w:webHidden/>
               </w:rPr>
-              <w:instrText xml:space="preserve"> PAGEREF _Toc228505769 \h </w:instrText>
+              <w:instrText xml:space="preserve"> PAGEREF _Toc228567342 \h </w:instrText>
             </w:r>
             <w:r>
               <w:rPr>
@@ -1052,7 +1052,7 @@
               <w:lang w:eastAsia="es-CO"/>
             </w:rPr>
           </w:pPr>
-          <w:hyperlink w:anchor="_Toc228505770" w:history="1">
+          <w:hyperlink w:anchor="_Toc228567343" w:history="1">
             <w:r>
               <w:rPr>
                 <w:rStyle w:val="Hipervnculo"/>
@@ -1095,7 +1095,7 @@
                 <w:noProof/>
                 <w:webHidden/>
               </w:rPr>
-              <w:instrText xml:space="preserve"> PAGEREF _Toc228505770 \h </w:instrText>
+              <w:instrText xml:space="preserve"> PAGEREF _Toc228567343 \h </w:instrText>
             </w:r>
             <w:r>
               <w:rPr>
@@ -1140,7 +1140,7 @@
               <w:lang w:eastAsia="es-CO"/>
             </w:rPr>
           </w:pPr>
-          <w:hyperlink w:anchor="_Toc228505771" w:history="1">
+          <w:hyperlink w:anchor="_Toc228567344" w:history="1">
             <w:r>
               <w:rPr>
                 <w:rStyle w:val="Hipervnculo"/>
@@ -1183,7 +1183,7 @@
                 <w:noProof/>
                 <w:webHidden/>
               </w:rPr>
-              <w:instrText xml:space="preserve"> PAGEREF _Toc228505771 \h </w:instrText>
+              <w:instrText xml:space="preserve"> PAGEREF _Toc228567344 \h </w:instrText>
             </w:r>
             <w:r>
               <w:rPr>
@@ -1228,7 +1228,7 @@
               <w:lang w:eastAsia="es-CO"/>
             </w:rPr>
           </w:pPr>
-          <w:hyperlink w:anchor="_Toc228505772" w:history="1">
+          <w:hyperlink w:anchor="_Toc228567345" w:history="1">
             <w:r>
               <w:rPr>
                 <w:rStyle w:val="Hipervnculo"/>
@@ -1271,7 +1271,7 @@
                 <w:noProof/>
                 <w:webHidden/>
               </w:rPr>
-              <w:instrText xml:space="preserve"> PAGEREF _Toc228505772 \h </w:instrText>
+              <w:instrText xml:space="preserve"> PAGEREF _Toc228567345 \h </w:instrText>
             </w:r>
             <w:r>
               <w:rPr>
@@ -1316,7 +1316,7 @@
               <w:lang w:eastAsia="es-CO"/>
             </w:rPr>
           </w:pPr>
-          <w:hyperlink w:anchor="_Toc228505773" w:history="1">
+          <w:hyperlink w:anchor="_Toc228567346" w:history="1">
             <w:r>
               <w:rPr>
                 <w:rStyle w:val="Hipervnculo"/>
@@ -1374,7 +1374,7 @@
                 <w:noProof/>
                 <w:webHidden/>
               </w:rPr>
-              <w:instrText xml:space="preserve"> PAGEREF _Toc228505773 \h </w:instrText>
+              <w:instrText xml:space="preserve"> PAGEREF _Toc228567346 \h </w:instrText>
             </w:r>
             <w:r>
               <w:rPr>
@@ -1394,7 +1394,7 @@
                 <w:noProof/>
                 <w:webHidden/>
               </w:rPr>
-              <w:t>5</w:t>
+              <w:t>0</w:t>
             </w:r>
             <w:r>
               <w:rPr>
@@ -1419,15 +1419,11 @@
               <w:lang w:eastAsia="es-CO"/>
             </w:rPr>
           </w:pPr>
-          <w:hyperlink w:anchor="_Toc228505774" w:history="1">
+          <w:hyperlink w:anchor="_Toc228567347" w:history="1">
             <w:r>
               <w:rPr>
                 <w:rStyle w:val="Hipervnculo"/>
-                <w:rFonts w:eastAsia="Times New Roman"/>
-                <w:b/>
-                <w:bCs/>
-                <w:noProof/>
-                <w:lang w:eastAsia="es-CO"/>
+                <w:noProof/>
               </w:rPr>
               <w:t>6.1.</w:t>
             </w:r>
@@ -1443,13 +1439,97 @@
             <w:r>
               <w:rPr>
                 <w:rStyle w:val="Hipervnculo"/>
-                <w:rFonts w:eastAsia="Times New Roman"/>
-                <w:b/>
-                <w:bCs/>
-                <w:noProof/>
+                <w:noProof/>
+              </w:rPr>
+              <w:t>Vocabulario (Símbolos y elementos del sistema)</w:t>
+            </w:r>
+            <w:r>
+              <w:rPr>
+                <w:noProof/>
+                <w:webHidden/>
+              </w:rPr>
+              <w:tab/>
+            </w:r>
+            <w:r>
+              <w:rPr>
+                <w:noProof/>
+                <w:webHidden/>
+              </w:rPr>
+              <w:fldChar w:fldCharType="begin"/>
+            </w:r>
+            <w:r>
+              <w:rPr>
+                <w:noProof/>
+                <w:webHidden/>
+              </w:rPr>
+              <w:instrText xml:space="preserve"> PAGEREF _Toc228567347 \h </w:instrText>
+            </w:r>
+            <w:r>
+              <w:rPr>
+                <w:noProof/>
+                <w:webHidden/>
+              </w:rPr>
+            </w:r>
+            <w:r>
+              <w:rPr>
+                <w:noProof/>
+                <w:webHidden/>
+              </w:rPr>
+              <w:fldChar w:fldCharType="separate"/>
+            </w:r>
+            <w:r>
+              <w:rPr>
+                <w:noProof/>
+                <w:webHidden/>
+              </w:rPr>
+              <w:t>0</w:t>
+            </w:r>
+            <w:r>
+              <w:rPr>
+                <w:noProof/>
+                <w:webHidden/>
+              </w:rPr>
+              <w:fldChar w:fldCharType="end"/>
+            </w:r>
+          </w:hyperlink>
+        </w:p>
+        <w:p>
+          <w:pPr>
+            <w:pStyle w:val="TDC2"/>
+            <w:tabs>
+              <w:tab w:val="left" w:pos="880"/>
+              <w:tab w:val="right" w:leader="dot" w:pos="8494"/>
+            </w:tabs>
+            <w:rPr>
+              <w:noProof/>
+              <w:sz w:val="22"/>
+              <w:szCs w:val="22"/>
+              <w:lang w:eastAsia="es-CO"/>
+            </w:rPr>
+          </w:pPr>
+          <w:hyperlink w:anchor="_Toc228567348" w:history="1">
+            <w:r>
+              <w:rPr>
+                <w:rStyle w:val="Hipervnculo"/>
+                <w:noProof/>
+              </w:rPr>
+              <w:t>6.2.</w:t>
+            </w:r>
+            <w:r>
+              <w:rPr>
+                <w:noProof/>
+                <w:sz w:val="22"/>
+                <w:szCs w:val="22"/>
                 <w:lang w:eastAsia="es-CO"/>
               </w:rPr>
-              <w:t>Vocabulario (Símbolos y elementos del sistema)</w:t>
+              <w:tab/>
+            </w:r>
+            <w:r>
+              <w:rPr>
+                <w:rStyle w:val="Hipervnculo"/>
+                <w:noProof/>
+              </w:rPr>
+              <w:t>AXIOMA (Principio genérico)</w:t>
             </w:r>
             <w:r>
               <w:rPr>
@@ -1470,7 +1550,7 @@
                 <w:noProof/>
                 <w:webHidden/>
               </w:rPr>
-              <w:instrText xml:space="preserve"> PAGEREF _Toc228505774 \h </w:instrText>
+              <w:instrText xml:space="preserve"> PAGEREF _Toc228567348 \h </w:instrText>
             </w:r>
             <w:r>
               <w:rPr>
@@ -1490,7 +1570,448 @@
                 <w:noProof/>
                 <w:webHidden/>
               </w:rPr>
-              <w:t>6</w:t>
+              <w:t>1</w:t>
+            </w:r>
+            <w:r>
+              <w:rPr>
+                <w:noProof/>
+                <w:webHidden/>
+              </w:rPr>
+              <w:fldChar w:fldCharType="end"/>
+            </w:r>
+          </w:hyperlink>
+        </w:p>
+        <w:p>
+          <w:pPr>
+            <w:pStyle w:val="TDC2"/>
+            <w:tabs>
+              <w:tab w:val="left" w:pos="880"/>
+              <w:tab w:val="right" w:leader="dot" w:pos="8494"/>
+            </w:tabs>
+            <w:rPr>
+              <w:noProof/>
+              <w:sz w:val="22"/>
+              <w:szCs w:val="22"/>
+              <w:lang w:eastAsia="es-CO"/>
+            </w:rPr>
+          </w:pPr>
+          <w:hyperlink w:anchor="_Toc228567349" w:history="1">
+            <w:r>
+              <w:rPr>
+                <w:rStyle w:val="Hipervnculo"/>
+                <w:noProof/>
+              </w:rPr>
+              <w:t>6.3.</w:t>
+            </w:r>
+            <w:r>
+              <w:rPr>
+                <w:noProof/>
+                <w:sz w:val="22"/>
+                <w:szCs w:val="22"/>
+                <w:lang w:eastAsia="es-CO"/>
+              </w:rPr>
+              <w:tab/>
+            </w:r>
+            <w:r>
+              <w:rPr>
+                <w:rStyle w:val="Hipervnculo"/>
+                <w:noProof/>
+              </w:rPr>
+              <w:t>REGLAS</w:t>
+            </w:r>
+            <w:r>
+              <w:rPr>
+                <w:noProof/>
+                <w:webHidden/>
+              </w:rPr>
+              <w:tab/>
+            </w:r>
+            <w:r>
+              <w:rPr>
+                <w:noProof/>
+                <w:webHidden/>
+              </w:rPr>
+              <w:fldChar w:fldCharType="begin"/>
+            </w:r>
+            <w:r>
+              <w:rPr>
+                <w:noProof/>
+                <w:webHidden/>
+              </w:rPr>
+              <w:instrText xml:space="preserve"> PAGEREF _Toc228567349 \h </w:instrText>
+            </w:r>
+            <w:r>
+              <w:rPr>
+                <w:noProof/>
+                <w:webHidden/>
+              </w:rPr>
+            </w:r>
+            <w:r>
+              <w:rPr>
+                <w:noProof/>
+                <w:webHidden/>
+              </w:rPr>
+              <w:fldChar w:fldCharType="separate"/>
+            </w:r>
+            <w:r>
+              <w:rPr>
+                <w:noProof/>
+                <w:webHidden/>
+              </w:rPr>
+              <w:t>0</w:t>
+            </w:r>
+            <w:r>
+              <w:rPr>
+                <w:noProof/>
+                <w:webHidden/>
+              </w:rPr>
+              <w:fldChar w:fldCharType="end"/>
+            </w:r>
+          </w:hyperlink>
+        </w:p>
+        <w:p>
+          <w:pPr>
+            <w:pStyle w:val="TDC2"/>
+            <w:tabs>
+              <w:tab w:val="left" w:pos="880"/>
+              <w:tab w:val="right" w:leader="dot" w:pos="8494"/>
+            </w:tabs>
+            <w:rPr>
+              <w:noProof/>
+              <w:sz w:val="22"/>
+              <w:szCs w:val="22"/>
+              <w:lang w:eastAsia="es-CO"/>
+            </w:rPr>
+          </w:pPr>
+          <w:hyperlink w:anchor="_Toc228567350" w:history="1">
+            <w:r>
+              <w:rPr>
+                <w:rStyle w:val="Hipervnculo"/>
+                <w:noProof/>
+              </w:rPr>
+              <w:t>6.4.</w:t>
+            </w:r>
+            <w:r>
+              <w:rPr>
+                <w:noProof/>
+                <w:sz w:val="22"/>
+                <w:szCs w:val="22"/>
+                <w:lang w:eastAsia="es-CO"/>
+              </w:rPr>
+              <w:tab/>
+            </w:r>
+            <w:r>
+              <w:rPr>
+                <w:rStyle w:val="Hipervnculo"/>
+                <w:noProof/>
+              </w:rPr>
+              <w:t>eJECUCIÓN</w:t>
+            </w:r>
+            <w:r>
+              <w:rPr>
+                <w:noProof/>
+                <w:webHidden/>
+              </w:rPr>
+              <w:tab/>
+            </w:r>
+            <w:r>
+              <w:rPr>
+                <w:noProof/>
+                <w:webHidden/>
+              </w:rPr>
+              <w:fldChar w:fldCharType="begin"/>
+            </w:r>
+            <w:r>
+              <w:rPr>
+                <w:noProof/>
+                <w:webHidden/>
+              </w:rPr>
+              <w:instrText xml:space="preserve"> PAGEREF _Toc228567350 \h </w:instrText>
+            </w:r>
+            <w:r>
+              <w:rPr>
+                <w:noProof/>
+                <w:webHidden/>
+              </w:rPr>
+            </w:r>
+            <w:r>
+              <w:rPr>
+                <w:noProof/>
+                <w:webHidden/>
+              </w:rPr>
+              <w:fldChar w:fldCharType="separate"/>
+            </w:r>
+            <w:r>
+              <w:rPr>
+                <w:noProof/>
+                <w:webHidden/>
+              </w:rPr>
+              <w:t>0</w:t>
+            </w:r>
+            <w:r>
+              <w:rPr>
+                <w:noProof/>
+                <w:webHidden/>
+              </w:rPr>
+              <w:fldChar w:fldCharType="end"/>
+            </w:r>
+          </w:hyperlink>
+        </w:p>
+        <w:p>
+          <w:pPr>
+            <w:pStyle w:val="TDC2"/>
+            <w:tabs>
+              <w:tab w:val="left" w:pos="880"/>
+              <w:tab w:val="right" w:leader="dot" w:pos="8494"/>
+            </w:tabs>
+            <w:rPr>
+              <w:noProof/>
+              <w:sz w:val="22"/>
+              <w:szCs w:val="22"/>
+              <w:lang w:eastAsia="es-CO"/>
+            </w:rPr>
+          </w:pPr>
+          <w:hyperlink w:anchor="_Toc228567351" w:history="1">
+            <w:r>
+              <w:rPr>
+                <w:rStyle w:val="Hipervnculo"/>
+                <w:noProof/>
+              </w:rPr>
+              <w:t>6.5.</w:t>
+            </w:r>
+            <w:r>
+              <w:rPr>
+                <w:noProof/>
+                <w:sz w:val="22"/>
+                <w:szCs w:val="22"/>
+                <w:lang w:eastAsia="es-CO"/>
+              </w:rPr>
+              <w:tab/>
+            </w:r>
+            <w:r>
+              <w:rPr>
+                <w:rStyle w:val="Hipervnculo"/>
+                <w:noProof/>
+              </w:rPr>
+              <w:t>resultado</w:t>
+            </w:r>
+            <w:r>
+              <w:rPr>
+                <w:noProof/>
+                <w:webHidden/>
+              </w:rPr>
+              <w:tab/>
+            </w:r>
+            <w:r>
+              <w:rPr>
+                <w:noProof/>
+                <w:webHidden/>
+              </w:rPr>
+              <w:fldChar w:fldCharType="begin"/>
+            </w:r>
+            <w:r>
+              <w:rPr>
+                <w:noProof/>
+                <w:webHidden/>
+              </w:rPr>
+              <w:instrText xml:space="preserve"> PAGEREF _Toc228567351 \h </w:instrText>
+            </w:r>
+            <w:r>
+              <w:rPr>
+                <w:noProof/>
+                <w:webHidden/>
+              </w:rPr>
+            </w:r>
+            <w:r>
+              <w:rPr>
+                <w:noProof/>
+                <w:webHidden/>
+              </w:rPr>
+              <w:fldChar w:fldCharType="separate"/>
+            </w:r>
+            <w:r>
+              <w:rPr>
+                <w:noProof/>
+                <w:webHidden/>
+              </w:rPr>
+              <w:t>0</w:t>
+            </w:r>
+            <w:r>
+              <w:rPr>
+                <w:noProof/>
+                <w:webHidden/>
+              </w:rPr>
+              <w:fldChar w:fldCharType="end"/>
+            </w:r>
+          </w:hyperlink>
+        </w:p>
+        <w:p>
+          <w:pPr>
+            <w:pStyle w:val="TDC2"/>
+            <w:tabs>
+              <w:tab w:val="left" w:pos="880"/>
+              <w:tab w:val="right" w:leader="dot" w:pos="8494"/>
+            </w:tabs>
+            <w:rPr>
+              <w:noProof/>
+              <w:sz w:val="22"/>
+              <w:szCs w:val="22"/>
+              <w:lang w:eastAsia="es-CO"/>
+            </w:rPr>
+          </w:pPr>
+          <w:hyperlink w:anchor="_Toc228567352" w:history="1">
+            <w:r>
+              <w:rPr>
+                <w:rStyle w:val="Hipervnculo"/>
+                <w:noProof/>
+              </w:rPr>
+              <w:t>6.6.</w:t>
+            </w:r>
+            <w:r>
+              <w:rPr>
+                <w:noProof/>
+                <w:sz w:val="22"/>
+                <w:szCs w:val="22"/>
+                <w:lang w:eastAsia="es-CO"/>
+              </w:rPr>
+              <w:tab/>
+            </w:r>
+            <w:r>
+              <w:rPr>
+                <w:rStyle w:val="Hipervnculo"/>
+                <w:noProof/>
+                <w:lang w:val="es-MX"/>
+              </w:rPr>
+              <w:t>Realice un wireframe de la interfaz de su herramienta</w:t>
+            </w:r>
+            <w:r>
+              <w:rPr>
+                <w:noProof/>
+                <w:webHidden/>
+              </w:rPr>
+              <w:tab/>
+            </w:r>
+            <w:r>
+              <w:rPr>
+                <w:noProof/>
+                <w:webHidden/>
+              </w:rPr>
+              <w:fldChar w:fldCharType="begin"/>
+            </w:r>
+            <w:r>
+              <w:rPr>
+                <w:noProof/>
+                <w:webHidden/>
+              </w:rPr>
+              <w:instrText xml:space="preserve"> PAGEREF _Toc228567352 \h </w:instrText>
+            </w:r>
+            <w:r>
+              <w:rPr>
+                <w:noProof/>
+                <w:webHidden/>
+              </w:rPr>
+            </w:r>
+            <w:r>
+              <w:rPr>
+                <w:noProof/>
+                <w:webHidden/>
+              </w:rPr>
+              <w:fldChar w:fldCharType="separate"/>
+            </w:r>
+            <w:r>
+              <w:rPr>
+                <w:noProof/>
+                <w:webHidden/>
+              </w:rPr>
+              <w:t>1</w:t>
+            </w:r>
+            <w:r>
+              <w:rPr>
+                <w:noProof/>
+                <w:webHidden/>
+              </w:rPr>
+              <w:fldChar w:fldCharType="end"/>
+            </w:r>
+          </w:hyperlink>
+        </w:p>
+        <w:p>
+          <w:pPr>
+            <w:pStyle w:val="TDC2"/>
+            <w:tabs>
+              <w:tab w:val="left" w:pos="880"/>
+              <w:tab w:val="right" w:leader="dot" w:pos="8494"/>
+            </w:tabs>
+            <w:rPr>
+              <w:noProof/>
+              <w:sz w:val="22"/>
+              <w:szCs w:val="22"/>
+              <w:lang w:eastAsia="es-CO"/>
+            </w:rPr>
+          </w:pPr>
+          <w:hyperlink w:anchor="_Toc228567353" w:history="1">
+            <w:r>
+              <w:rPr>
+                <w:rStyle w:val="Hipervnculo"/>
+                <w:noProof/>
+              </w:rPr>
+              <w:t>6.7.</w:t>
+            </w:r>
+            <w:r>
+              <w:rPr>
+                <w:noProof/>
+                <w:sz w:val="22"/>
+                <w:szCs w:val="22"/>
+                <w:lang w:eastAsia="es-CO"/>
+              </w:rPr>
+              <w:tab/>
+            </w:r>
+            <w:r>
+              <w:rPr>
+                <w:rStyle w:val="Hipervnculo"/>
+                <w:noProof/>
+              </w:rPr>
+              <w:t>Diseñe (en Sketch o LowPoly) uno de los posibles resultados esperados de su herramienta.</w:t>
+            </w:r>
+            <w:r>
+              <w:rPr>
+                <w:noProof/>
+                <w:webHidden/>
+              </w:rPr>
+              <w:tab/>
+            </w:r>
+            <w:r>
+              <w:rPr>
+                <w:noProof/>
+                <w:webHidden/>
+              </w:rPr>
+              <w:fldChar w:fldCharType="begin"/>
+            </w:r>
+            <w:r>
+              <w:rPr>
+                <w:noProof/>
+                <w:webHidden/>
+              </w:rPr>
+              <w:instrText xml:space="preserve"> PAGEREF _Toc228567353 \h </w:instrText>
+            </w:r>
+            <w:r>
+              <w:rPr>
+                <w:noProof/>
+                <w:webHidden/>
+              </w:rPr>
+            </w:r>
+            <w:r>
+              <w:rPr>
+                <w:noProof/>
+                <w:webHidden/>
+              </w:rPr>
+              <w:fldChar w:fldCharType="separate"/>
+            </w:r>
+            <w:r>
+              <w:rPr>
+                <w:noProof/>
+                <w:webHidden/>
+              </w:rPr>
+              <w:t>3</w:t>
             </w:r>
             <w:r>
               <w:rPr>
@@ -1743,199 +2264,103 @@
     </w:p>
     <w:p>
       <w:pPr>
-        <w:pStyle w:val="Prrafodelista"/>
+        <w:pStyle w:val="Ttulo1"/>
+      </w:pPr>
+      <w:bookmarkStart w:id="1" w:name="_Toc228567342"/>
+      <w:r>
+        <w:lastRenderedPageBreak/>
+        <w:t xml:space="preserve">Nombre de los </w:t>
+      </w:r>
+      <w:r>
+        <w:t>artistas</w:t>
+      </w:r>
+      <w:r>
+        <w:t xml:space="preserve"> técnicos</w:t>
+      </w:r>
+      <w:bookmarkEnd w:id="1"/>
+      <w:r>
+        <w:t xml:space="preserve"> </w:t>
+      </w:r>
+    </w:p>
+    <w:p>
+      <w:pPr>
+        <w:jc w:val="center"/>
         <w:rPr>
           <w:b/>
           <w:bCs/>
           <w:sz w:val="24"/>
           <w:szCs w:val="24"/>
-          <w:lang w:val="es-MX"/>
         </w:rPr>
       </w:pPr>
     </w:p>
     <w:p>
       <w:pPr>
-        <w:pStyle w:val="Prrafodelista"/>
+        <w:spacing w:after="0" w:line="240" w:lineRule="auto"/>
+        <w:ind w:left="708"/>
+        <w:rPr>
+          <w:sz w:val="24"/>
+          <w:szCs w:val="24"/>
+        </w:rPr>
+      </w:pPr>
+      <w:r>
+        <w:rPr>
+          <w:sz w:val="24"/>
+          <w:szCs w:val="24"/>
+        </w:rPr>
+        <w:t xml:space="preserve">Mayerly Camargo Pedraza Código 1202327 </w:t>
+      </w:r>
+    </w:p>
+    <w:p>
+      <w:pPr>
+        <w:spacing w:after="0" w:line="240" w:lineRule="auto"/>
+        <w:ind w:left="708"/>
+        <w:rPr>
+          <w:sz w:val="24"/>
+          <w:szCs w:val="24"/>
+        </w:rPr>
+      </w:pPr>
+      <w:r>
+        <w:rPr>
+          <w:sz w:val="24"/>
+          <w:szCs w:val="24"/>
+        </w:rPr>
+        <w:t>Jennifer Lizeth Leiva Código 1202617</w:t>
+      </w:r>
+    </w:p>
+    <w:p>
+      <w:pPr>
+        <w:spacing w:after="0" w:line="240" w:lineRule="auto"/>
+        <w:ind w:left="708"/>
+        <w:rPr>
+          <w:sz w:val="24"/>
+          <w:szCs w:val="24"/>
+        </w:rPr>
+      </w:pPr>
+      <w:r>
+        <w:rPr>
+          <w:sz w:val="24"/>
+          <w:szCs w:val="24"/>
+        </w:rPr>
+        <w:t xml:space="preserve">Docente: Diego Felipe Beltrán Cardona </w:t>
+      </w:r>
+    </w:p>
+    <w:p>
+      <w:pPr>
+        <w:spacing w:after="0" w:line="240" w:lineRule="auto"/>
+        <w:ind w:left="708"/>
         <w:rPr>
           <w:b/>
           <w:bCs/>
           <w:sz w:val="24"/>
           <w:szCs w:val="24"/>
-          <w:lang w:val="es-MX"/>
         </w:rPr>
       </w:pPr>
     </w:p>
     <w:p>
       <w:pPr>
-        <w:pStyle w:val="Prrafodelista"/>
-        <w:rPr>
-          <w:b/>
-          <w:bCs/>
-          <w:sz w:val="24"/>
-          <w:szCs w:val="24"/>
-          <w:lang w:val="es-MX"/>
-        </w:rPr>
-      </w:pPr>
-    </w:p>
-    <w:p>
-      <w:pPr>
-        <w:pStyle w:val="Prrafodelista"/>
-        <w:rPr>
-          <w:b/>
-          <w:bCs/>
-          <w:sz w:val="24"/>
-          <w:szCs w:val="24"/>
-          <w:lang w:val="es-MX"/>
-        </w:rPr>
-      </w:pPr>
-    </w:p>
-    <w:p>
-      <w:pPr>
-        <w:pStyle w:val="Prrafodelista"/>
-        <w:rPr>
-          <w:b/>
-          <w:bCs/>
-          <w:sz w:val="24"/>
-          <w:szCs w:val="24"/>
-          <w:lang w:val="es-MX"/>
-        </w:rPr>
-      </w:pPr>
-    </w:p>
-    <w:p>
-      <w:pPr>
-        <w:pStyle w:val="Prrafodelista"/>
-        <w:rPr>
-          <w:b/>
-          <w:bCs/>
-          <w:sz w:val="24"/>
-          <w:szCs w:val="24"/>
-          <w:lang w:val="es-MX"/>
-        </w:rPr>
-      </w:pPr>
-    </w:p>
-    <w:p>
-      <w:pPr>
-        <w:pStyle w:val="Prrafodelista"/>
-        <w:rPr>
-          <w:b/>
-          <w:bCs/>
-          <w:sz w:val="24"/>
-          <w:szCs w:val="24"/>
-          <w:lang w:val="es-MX"/>
-        </w:rPr>
-      </w:pPr>
-    </w:p>
-    <w:p>
-      <w:pPr>
-        <w:pStyle w:val="Prrafodelista"/>
-        <w:rPr>
-          <w:b/>
-          <w:bCs/>
-          <w:sz w:val="24"/>
-          <w:szCs w:val="24"/>
-          <w:lang w:val="es-MX"/>
-        </w:rPr>
-      </w:pPr>
-    </w:p>
-    <w:p>
-      <w:pPr>
         <w:pStyle w:val="Ttulo1"/>
       </w:pPr>
-      <w:bookmarkStart w:id="1" w:name="_Toc228505769"/>
-      <w:r>
-        <w:lastRenderedPageBreak/>
-        <w:t xml:space="preserve">Nombre de los </w:t>
-      </w:r>
-      <w:r>
-        <w:t>artistas</w:t>
-      </w:r>
-      <w:r>
-        <w:t xml:space="preserve"> técnicos</w:t>
-      </w:r>
-      <w:bookmarkEnd w:id="1"/>
-      <w:r>
-        <w:t xml:space="preserve"> </w:t>
-      </w:r>
-    </w:p>
-    <w:p>
-      <w:pPr>
-        <w:jc w:val="center"/>
-        <w:rPr>
-          <w:b/>
-          <w:bCs/>
-          <w:sz w:val="24"/>
-          <w:szCs w:val="24"/>
-        </w:rPr>
-      </w:pPr>
-    </w:p>
-    <w:p>
-      <w:pPr>
-        <w:spacing w:after="0" w:line="240" w:lineRule="auto"/>
-        <w:ind w:left="708"/>
-        <w:rPr>
-          <w:sz w:val="24"/>
-          <w:szCs w:val="24"/>
-        </w:rPr>
-      </w:pPr>
-      <w:r>
-        <w:rPr>
-          <w:sz w:val="24"/>
-          <w:szCs w:val="24"/>
-        </w:rPr>
-        <w:t xml:space="preserve">Mayerly Camargo Pedraza Código 1202327 </w:t>
-      </w:r>
-    </w:p>
-    <w:p>
-      <w:pPr>
-        <w:spacing w:after="0" w:line="240" w:lineRule="auto"/>
-        <w:ind w:left="708"/>
-        <w:rPr>
-          <w:sz w:val="24"/>
-          <w:szCs w:val="24"/>
-        </w:rPr>
-      </w:pPr>
-      <w:r>
-        <w:rPr>
-          <w:sz w:val="24"/>
-          <w:szCs w:val="24"/>
-        </w:rPr>
-        <w:t>Jennifer Lizeth Leiva Código 1202617</w:t>
-      </w:r>
-    </w:p>
-    <w:p>
-      <w:pPr>
-        <w:spacing w:after="0" w:line="240" w:lineRule="auto"/>
-        <w:ind w:left="708"/>
-        <w:rPr>
-          <w:sz w:val="24"/>
-          <w:szCs w:val="24"/>
-        </w:rPr>
-      </w:pPr>
-      <w:r>
-        <w:rPr>
-          <w:sz w:val="24"/>
-          <w:szCs w:val="24"/>
-        </w:rPr>
-        <w:t xml:space="preserve">Docente: Diego Felipe Beltrán Cardona </w:t>
-      </w:r>
-    </w:p>
-    <w:p>
-      <w:pPr>
-        <w:spacing w:after="0" w:line="240" w:lineRule="auto"/>
-        <w:ind w:left="708"/>
-        <w:rPr>
-          <w:b/>
-          <w:bCs/>
-          <w:sz w:val="24"/>
-          <w:szCs w:val="24"/>
-        </w:rPr>
-      </w:pPr>
-    </w:p>
-    <w:p>
-      <w:pPr>
-        <w:pStyle w:val="Ttulo1"/>
-      </w:pPr>
-      <w:bookmarkStart w:id="2" w:name="_Toc228505770"/>
+      <w:bookmarkStart w:id="2" w:name="_Toc228567343"/>
       <w:r>
         <w:t>Nombre de la Herramienta:</w:t>
       </w:r>
@@ -1976,7 +2401,7 @@
       <w:pPr>
         <w:pStyle w:val="Ttulo1"/>
       </w:pPr>
-      <w:bookmarkStart w:id="3" w:name="_Toc228505771"/>
+      <w:bookmarkStart w:id="3" w:name="_Toc228567344"/>
       <w:r>
         <w:t>¿Cuál es el concepto artístico de su herramienta?</w:t>
       </w:r>
@@ -2785,7 +3210,7 @@
       <w:pPr>
         <w:pStyle w:val="Ttulo1"/>
       </w:pPr>
-      <w:bookmarkStart w:id="4" w:name="_Toc228505772"/>
+      <w:bookmarkStart w:id="4" w:name="_Toc228567345"/>
       <w:r>
         <w:lastRenderedPageBreak/>
         <w:t xml:space="preserve">¿Cuáles referentes artísticos y técnicos tienen su herramienta?, </w:t>
@@ -5285,8 +5710,7 @@
       <w:pPr>
         <w:pStyle w:val="Ttulo1"/>
       </w:pPr>
-      <w:bookmarkStart w:id="5" w:name="_Toc228505774"/>
-      <w:bookmarkStart w:id="6" w:name="_Toc228505773"/>
+      <w:bookmarkStart w:id="5" w:name="_Toc228567346"/>
       <w:r>
         <w:lastRenderedPageBreak/>
         <w:t xml:space="preserve">Describa el algoritmo de </w:t>
@@ -5300,7 +5724,7 @@
       <w:r>
         <w:t xml:space="preserve"> que va a utilizar, incluyendo los procesos de Modelado y Rigging procedural en maya.</w:t>
       </w:r>
-      <w:bookmarkEnd w:id="6"/>
+      <w:bookmarkEnd w:id="5"/>
     </w:p>
     <w:p>
       <w:pPr>
@@ -5313,10 +5737,11 @@
       <w:pPr>
         <w:pStyle w:val="Ttulo2"/>
       </w:pPr>
+      <w:bookmarkStart w:id="6" w:name="_Toc228567347"/>
       <w:r>
         <w:t>Vocabulario (Símbolos y elementos del sistema)</w:t>
       </w:r>
-      <w:bookmarkEnd w:id="5"/>
+      <w:bookmarkEnd w:id="6"/>
     </w:p>
     <w:p>
       <w:pPr>
@@ -5933,6 +6358,7 @@
       <w:pPr>
         <w:pStyle w:val="Ttulo2"/>
       </w:pPr>
+      <w:bookmarkStart w:id="7" w:name="_Toc228567348"/>
       <w:r>
         <w:lastRenderedPageBreak/>
         <w:t xml:space="preserve">AXIOMA </w:t>
@@ -5940,6 +6366,7 @@
       <w:r>
         <w:t>(Principio genérico)</w:t>
       </w:r>
+      <w:bookmarkEnd w:id="7"/>
     </w:p>
     <w:p>
       <w:pPr>
@@ -6048,6 +6475,7 @@
             <w:r>
               <w:rPr>
                 <w:rFonts w:eastAsia="Times New Roman" w:cs="Times New Roman"/>
+                <w:noProof/>
                 <w:sz w:val="24"/>
                 <w:szCs w:val="24"/>
                 <w:lang w:eastAsia="es-CO"/>
@@ -6526,9 +6954,14 @@
       <w:pPr>
         <w:pStyle w:val="Ttulo2"/>
       </w:pPr>
+      <w:bookmarkStart w:id="8" w:name="_Toc228567349"/>
       <w:r>
         <w:lastRenderedPageBreak/>
-        <w:t xml:space="preserve">REGLAS </w:t>
+        <w:t>REGLAS</w:t>
+      </w:r>
+      <w:bookmarkEnd w:id="8"/>
+      <w:r>
+        <w:t xml:space="preserve"> </w:t>
       </w:r>
     </w:p>
     <w:p>
@@ -7655,13 +8088,7 @@
                     <w:ind w:left="0"/>
                   </w:pPr>
                   <w:r>
-                    <w:t>Oreja_</w:t>
-                  </w:r>
-                  <w:r>
-                    <w:t>Derecha</w:t>
-                  </w:r>
-                  <w:r>
-                    <w:t>_00</w:t>
+                    <w:t>Oreja_Derecha_00</w:t>
                   </w:r>
                   <w:r>
                     <w:rPr>
@@ -7819,21 +8246,7 @@
                       <w:b/>
                       <w:bCs/>
                     </w:rPr>
-                    <w:t>Parte</w:t>
-                  </w:r>
-                  <w:r>
-                    <w:rPr>
-                      <w:b/>
-                      <w:bCs/>
-                    </w:rPr>
-                    <w:t>Inferior</w:t>
-                  </w:r>
-                  <w:r>
-                    <w:rPr>
-                      <w:b/>
-                      <w:bCs/>
-                    </w:rPr>
-                    <w:t>_Grupo</w:t>
+                    <w:t>ParteInferior_Grupo</w:t>
                   </w:r>
                 </w:p>
               </w:tc>
@@ -7945,10 +8358,7 @@
                     <w:ind w:left="0"/>
                   </w:pPr>
                   <w:r>
-                    <w:t>Pie</w:t>
-                  </w:r>
-                  <w:r>
-                    <w:t>Izquierdo_Primitiva_00</w:t>
+                    <w:t>PieIzquierdo_Primitiva_00</w:t>
                   </w:r>
                   <w:r>
                     <w:rPr>
@@ -8068,10 +8478,7 @@
                     <w:ind w:left="0"/>
                   </w:pPr>
                   <w:r>
-                    <w:t>Pie</w:t>
-                  </w:r>
-                  <w:r>
-                    <w:t>Derecho_Primitiva_00</w:t>
+                    <w:t>PieDerecho_Primitiva_00</w:t>
                   </w:r>
                   <w:r>
                     <w:rPr>
@@ -8191,10 +8598,7 @@
                     <w:ind w:left="0"/>
                   </w:pPr>
                   <w:r>
-                    <w:t>Tronco</w:t>
-                  </w:r>
-                  <w:r>
-                    <w:t>_Primitiva_0</w:t>
+                    <w:t>Tronco_Primitiva_0</w:t>
                   </w:r>
                   <w:r>
                     <w:rPr>
@@ -8314,16 +8718,7 @@
                     <w:ind w:left="0"/>
                   </w:pPr>
                   <w:r>
-                    <w:t>Mano</w:t>
-                  </w:r>
-                  <w:r>
-                    <w:t>Izquierd</w:t>
-                  </w:r>
-                  <w:r>
-                    <w:t>a</w:t>
-                  </w:r>
-                  <w:r>
-                    <w:t>_Primitiva_0</w:t>
+                    <w:t>ManoIzquierda_Primitiva_0</w:t>
                   </w:r>
                   <w:r>
                     <w:rPr>
@@ -8443,16 +8838,7 @@
                     <w:ind w:left="0"/>
                   </w:pPr>
                   <w:r>
-                    <w:t>Mano</w:t>
-                  </w:r>
-                  <w:r>
-                    <w:t>Derech</w:t>
-                  </w:r>
-                  <w:r>
-                    <w:t>a</w:t>
-                  </w:r>
-                  <w:r>
-                    <w:t>_Primitiva_0</w:t>
+                    <w:t>ManoDerecha_Primitiva_0</w:t>
                   </w:r>
                   <w:r>
                     <w:rPr>
@@ -8572,10 +8958,7 @@
                     <w:ind w:left="0"/>
                   </w:pPr>
                   <w:r>
-                    <w:t>Cola</w:t>
-                  </w:r>
-                  <w:r>
-                    <w:t>_Primitiva_0</w:t>
+                    <w:t>Cola_Primitiva_0</w:t>
                   </w:r>
                   <w:r>
                     <w:rPr>
@@ -8583,15 +8966,7 @@
                       <w:bCs/>
                       <w:color w:val="C00000"/>
                     </w:rPr>
-                    <w:t>1</w:t>
-                  </w:r>
-                  <w:r>
-                    <w:rPr>
-                      <w:b/>
-                      <w:bCs/>
-                      <w:color w:val="C00000"/>
-                    </w:rPr>
-                    <w:t>3</w:t>
+                    <w:t>13</w:t>
                   </w:r>
                 </w:p>
               </w:tc>
@@ -9008,13 +9383,7 @@
               <w:t>N</w:t>
             </w:r>
             <w:r>
-              <w:t xml:space="preserve">uestra paleta de colores </w:t>
-            </w:r>
-            <w:r>
-              <w:t>será</w:t>
-            </w:r>
-            <w:r>
-              <w:t xml:space="preserve"> Monocromática para cada conejo</w:t>
+              <w:t>uestra paleta de colores será Monocromática para cada conejo</w:t>
             </w:r>
             <w:r>
               <w:t xml:space="preserve"> en tonos pasteles.</w:t>
@@ -9038,13 +9407,7 @@
               <w:t xml:space="preserve"> el conejo</w:t>
             </w:r>
             <w:r>
-              <w:t xml:space="preserve">, ya que </w:t>
-            </w:r>
-            <w:r>
-              <w:t>cada emoción está asociada a un color</w:t>
-            </w:r>
-            <w:r>
-              <w:t xml:space="preserve"> de la s</w:t>
+              <w:t>, ya que cada emoción está asociada a un color de la s</w:t>
             </w:r>
             <w:r>
               <w:t>iguiente paleta</w:t>
@@ -9737,9 +10100,6 @@
             <w:pPr>
               <w:pStyle w:val="Prrafodelista"/>
               <w:ind w:left="166"/>
-              <w:rPr>
-                <w:lang w:val="en-CA"/>
-              </w:rPr>
             </w:pPr>
           </w:p>
         </w:tc>
@@ -9822,6 +10182,7 @@
               <w:rPr>
                 <w:b/>
                 <w:bCs/>
+                <w:noProof/>
                 <w:lang w:val="en-CA"/>
               </w:rPr>
               <w:drawing>
@@ -9919,11 +10280,19 @@
               <w:pStyle w:val="Prrafodelista"/>
               <w:ind w:left="166"/>
             </w:pPr>
+            <w:proofErr w:type="spellStart"/>
             <w:r>
               <w:rPr>
                 <w:lang w:val="en-CA"/>
               </w:rPr>
-              <w:t xml:space="preserve">Estilo: </w:t>
+              <w:t>Estilo</w:t>
+            </w:r>
+            <w:proofErr w:type="spellEnd"/>
+            <w:r>
+              <w:rPr>
+                <w:lang w:val="en-CA"/>
+              </w:rPr>
+              <w:t xml:space="preserve">: </w:t>
             </w:r>
             <w:proofErr w:type="spellStart"/>
             <w:r>
@@ -10493,14 +10862,7 @@
                 <w:b/>
                 <w:bCs/>
               </w:rPr>
-              <w:t>VARIACI</w:t>
-            </w:r>
-            <w:r>
-              <w:rPr>
-                <w:b/>
-                <w:bCs/>
-              </w:rPr>
-              <w:t>ÓN</w:t>
+              <w:t>VARIACIÓN</w:t>
             </w:r>
           </w:p>
           <w:p>
@@ -10533,10 +10895,7 @@
           <w:p/>
           <w:p>
             <w:r>
-              <w:t xml:space="preserve">Tendremos 3 tipos de </w:t>
-            </w:r>
-            <w:r>
-              <w:t>Morfología</w:t>
+              <w:t>Tendremos 3 tipos de Morfología</w:t>
             </w:r>
           </w:p>
           <w:p/>
@@ -10757,23 +11116,7 @@
                 <w:color w:val="00C6BB" w:themeColor="accent1"/>
                 <w:u w:val="single"/>
               </w:rPr>
-              <w:t>La medida del ancho de cabeza, se generará de manera aleatoria en el rango de 20 a 4</w:t>
-            </w:r>
-            <w:r>
-              <w:rPr>
-                <w:rFonts w:ascii="Berlin Sans FB" w:eastAsia="Arial Unicode MS" w:hAnsi="Berlin Sans FB" w:cs="Arial Unicode MS"/>
-                <w:color w:val="00C6BB" w:themeColor="accent1"/>
-                <w:u w:val="single"/>
-              </w:rPr>
-              <w:t>3</w:t>
-            </w:r>
-            <w:r>
-              <w:rPr>
-                <w:rFonts w:ascii="Berlin Sans FB" w:eastAsia="Arial Unicode MS" w:hAnsi="Berlin Sans FB" w:cs="Arial Unicode MS"/>
-                <w:color w:val="00C6BB" w:themeColor="accent1"/>
-                <w:u w:val="single"/>
-              </w:rPr>
-              <w:t xml:space="preserve"> cm.</w:t>
+              <w:t>La medida del ancho de cabeza, se generará de manera aleatoria en el rango de 20 a 43 cm.</w:t>
             </w:r>
           </w:p>
           <w:p>
@@ -11041,31 +11384,7 @@
           <w:p/>
           <w:p>
             <w:r>
-              <w:t xml:space="preserve">Todos </w:t>
-            </w:r>
-            <w:r>
-              <w:t xml:space="preserve">los conejos </w:t>
-            </w:r>
-            <w:r>
-              <w:t>tendrán las mismas medidas en proporciones del conejo estándar</w:t>
-            </w:r>
-            <w:r>
-              <w:t>,</w:t>
-            </w:r>
-            <w:r>
-              <w:t xml:space="preserve"> exceptuando las cuatro medidas resaltadas en </w:t>
-            </w:r>
-            <w:r>
-              <w:t>verde</w:t>
-            </w:r>
-            <w:r>
-              <w:t xml:space="preserve">, </w:t>
-            </w:r>
-            <w:r>
-              <w:t>las cuales s</w:t>
-            </w:r>
-            <w:r>
-              <w:t>i cambiarán.</w:t>
+              <w:t>Todos los conejos tendrán las mismas medidas en proporciones del conejo estándar, exceptuando las cuatro medidas resaltadas en verde, las cuales si cambiarán.</w:t>
             </w:r>
           </w:p>
           <w:p/>
@@ -11470,10 +11789,12 @@
       <w:pPr>
         <w:pStyle w:val="Ttulo2"/>
       </w:pPr>
+      <w:bookmarkStart w:id="9" w:name="_Toc228567350"/>
       <w:r>
         <w:lastRenderedPageBreak/>
         <w:t>eJECUCIÓN</w:t>
       </w:r>
+      <w:bookmarkEnd w:id="9"/>
     </w:p>
     <w:tbl>
       <w:tblPr>
@@ -11968,9 +12289,11 @@
       <w:pPr>
         <w:pStyle w:val="Ttulo2"/>
       </w:pPr>
+      <w:bookmarkStart w:id="10" w:name="_Toc228567351"/>
       <w:r>
         <w:t>resultado</w:t>
       </w:r>
+      <w:bookmarkEnd w:id="10"/>
     </w:p>
     <w:p>
       <w:pPr>
@@ -12421,13 +12744,13 @@
         </w:rPr>
         <w:t>.</w:t>
       </w:r>
-      <w:commentRangeStart w:id="7"/>
-      <w:commentRangeEnd w:id="7"/>
+      <w:commentRangeStart w:id="11"/>
+      <w:commentRangeEnd w:id="11"/>
       <w:r>
         <w:rPr>
           <w:rStyle w:val="Refdecomentario"/>
         </w:rPr>
-        <w:commentReference w:id="7"/>
+        <w:commentReference w:id="11"/>
       </w:r>
     </w:p>
     <w:p>
@@ -12946,26 +13269,14 @@
       <w:pPr>
         <w:pStyle w:val="Ttulo2"/>
       </w:pPr>
+      <w:bookmarkStart w:id="12" w:name="_Toc228567352"/>
       <w:r>
         <w:rPr>
           <w:lang w:val="es-MX"/>
         </w:rPr>
-        <w:t xml:space="preserve">Realice un </w:t>
-      </w:r>
-      <w:proofErr w:type="spellStart"/>
-      <w:r>
-        <w:rPr>
-          <w:lang w:val="es-MX"/>
-        </w:rPr>
-        <w:t>wireframe</w:t>
-      </w:r>
-      <w:proofErr w:type="spellEnd"/>
-      <w:r>
-        <w:rPr>
-          <w:lang w:val="es-MX"/>
-        </w:rPr>
-        <w:t xml:space="preserve"> de la interfaz de su herramienta</w:t>
-      </w:r>
+        <w:t>Realice un wireframe de la interfaz de su herramienta</w:t>
+      </w:r>
+      <w:bookmarkEnd w:id="12"/>
     </w:p>
     <w:p>
       <w:pPr>
@@ -13866,6 +14177,7 @@
           <w:shd w:val="clear" w:color="auto" w:fill="auto"/>
         </w:rPr>
       </w:pPr>
+      <w:bookmarkStart w:id="13" w:name="_Toc228567353"/>
       <w:r>
         <w:rPr>
           <w:rStyle w:val="Ttulo2Car"/>
@@ -13876,6 +14188,7 @@
         </w:rPr>
         <w:t>Diseñe (en Sketch o LowPoly) uno de los posibles resultados esperados de su herramienta.</w:t>
       </w:r>
+      <w:bookmarkEnd w:id="13"/>
     </w:p>
     <w:p>
       <w:pPr>
@@ -13948,7 +14261,7 @@
 
 <file path=word/comments.xml><?xml version="1.0" encoding="utf-8"?>
 <w:comments xmlns:wpc="http://schemas.microsoft.com/office/word/2010/wordprocessingCanvas" xmlns:cx="http://schemas.microsoft.com/office/drawing/2014/chartex" xmlns:cx1="http://schemas.microsoft.com/office/drawing/2015/9/8/chartex" xmlns:cx2="http://schemas.microsoft.com/office/drawing/2015/10/21/chartex" xmlns:cx3="http://schemas.microsoft.com/office/drawing/2016/5/9/chartex" xmlns:cx4="http://schemas.microsoft.com/office/drawing/2016/5/10/chartex" xmlns:cx5="http://schemas.microsoft.com/office/drawing/2016/5/11/chartex" xmlns:cx6="http://schemas.microsoft.com/office/drawing/2016/5/12/chartex" xmlns:cx7="http://schemas.microsoft.com/office/drawing/2016/5/13/chartex" xmlns:cx8="http://schemas.microsoft.com/office/drawing/2016/5/14/chartex" xmlns:mc="http://schemas.openxmlformats.org/markup-compatibility/2006" xmlns:aink="http://schemas.microsoft.com/office/drawing/2016/ink" xmlns:am3d="http://schemas.microsoft.com/office/drawing/2017/model3d" xmlns:o="urn:schemas-microsoft-com:office:office" xmlns:r="http://schemas.openxmlformats.org/officeDocument/2006/relationships" xmlns:m="http://schemas.openxmlformats.org/officeDocument/2006/math" xmlns:v="urn:schemas-microsoft-com:vml" xmlns:wp14="http://schemas.microsoft.com/office/word/2010/wordprocessingDrawing" xmlns:wp="http://schemas.openxmlformats.org/drawingml/2006/wordprocessingDrawing" xmlns:w10="urn:schemas-microsoft-com:office:word" xmlns:w="http://schemas.openxmlformats.org/wordprocessingml/2006/main" xmlns:w14="http://schemas.microsoft.com/office/word/2010/wordml" xmlns:w15="http://schemas.microsoft.com/office/word/2012/wordml" xmlns:w16cex="http://schemas.microsoft.com/office/word/2018/wordml/cex" xmlns:w16cid="http://schemas.microsoft.com/office/word/2016/wordml/cid" xmlns:w16="http://schemas.microsoft.com/office/word/2018/wordml" xmlns:w16sdtdh="http://schemas.microsoft.com/office/word/2020/wordml/sdtdatahash" xmlns:w16se="http://schemas.microsoft.com/office/word/2015/wordml/symex" xmlns:wpg="http://schemas.microsoft.com/office/word/2010/wordprocessingGroup" xmlns:wpi="http://schemas.microsoft.com/office/word/2010/wordprocessingInk" xmlns:wne="http://schemas.microsoft.com/office/word/2006/wordml" xmlns:wps="http://schemas.microsoft.com/office/word/2010/wordprocessingShape" mc:Ignorable="w14 w15 w16se w16cid w16 w16cex w16sdtdh wp14">
-  <w:comment w:id="7" w:author="Diana Mayerly Camargo Pedraza" w:date="2026-05-01T05:17:00Z" w:initials="DMCP">
+  <w:comment w:id="11" w:author="Diana Mayerly Camargo Pedraza" w:date="2026-05-01T05:17:00Z" w:initials="DMCP">
     <w:p>
       <w:pPr>
         <w:pStyle w:val="Textocomentario"/>

</xml_diff>